<commit_message>
Carga dos arquivos de eleitoral
</commit_message>
<xml_diff>
--- a/tabelas/t3_tabela_indicadores.docx
+++ b/tabelas/t3_tabela_indicadores.docx
@@ -487,7 +487,7 @@
                 <w:szCs w:val="20"/>
                 <w:color w:val="000000"/>
               </w:rPr>
-              <w:t xml:space="preserve">0</w:t>
+              <w:t xml:space="preserve">1</w:t>
             </w:r>
           </w:p>
         </w:tc>
@@ -767,7 +767,7 @@
                 <w:szCs w:val="20"/>
                 <w:color w:val="000000"/>
               </w:rPr>
-              <w:t xml:space="preserve">0</w:t>
+              <w:t xml:space="preserve">1</w:t>
             </w:r>
           </w:p>
         </w:tc>
@@ -1047,7 +1047,7 @@
                 <w:szCs w:val="20"/>
                 <w:color w:val="000000"/>
               </w:rPr>
-              <w:t xml:space="preserve">0</w:t>
+              <w:t xml:space="preserve">1</w:t>
             </w:r>
           </w:p>
         </w:tc>
@@ -1327,7 +1327,7 @@
                 <w:szCs w:val="20"/>
                 <w:color w:val="000000"/>
               </w:rPr>
-              <w:t xml:space="preserve">0</w:t>
+              <w:t xml:space="preserve">1</w:t>
             </w:r>
           </w:p>
         </w:tc>
@@ -1607,7 +1607,7 @@
                 <w:szCs w:val="20"/>
                 <w:color w:val="000000"/>
               </w:rPr>
-              <w:t xml:space="preserve">0</w:t>
+              <w:t xml:space="preserve">1</w:t>
             </w:r>
           </w:p>
         </w:tc>
@@ -2447,7 +2447,7 @@
                 <w:szCs w:val="20"/>
                 <w:color w:val="000000"/>
               </w:rPr>
-              <w:t xml:space="preserve">0</w:t>
+              <w:t xml:space="preserve">1</w:t>
             </w:r>
           </w:p>
         </w:tc>
@@ -3847,7 +3847,7 @@
                 <w:szCs w:val="20"/>
                 <w:color w:val="000000"/>
               </w:rPr>
-              <w:t xml:space="preserve">0</w:t>
+              <w:t xml:space="preserve">1</w:t>
             </w:r>
           </w:p>
         </w:tc>
@@ -4127,7 +4127,7 @@
                 <w:szCs w:val="20"/>
                 <w:color w:val="000000"/>
               </w:rPr>
-              <w:t xml:space="preserve">0</w:t>
+              <w:t xml:space="preserve">1</w:t>
             </w:r>
           </w:p>
         </w:tc>
@@ -6087,7 +6087,7 @@
                 <w:szCs w:val="20"/>
                 <w:color w:val="000000"/>
               </w:rPr>
-              <w:t xml:space="preserve">1</w:t>
+              <w:t xml:space="preserve">0</w:t>
             </w:r>
           </w:p>
         </w:tc>
@@ -6367,7 +6367,7 @@
                 <w:szCs w:val="20"/>
                 <w:color w:val="000000"/>
               </w:rPr>
-              <w:t xml:space="preserve">1</w:t>
+              <w:t xml:space="preserve">0</w:t>
             </w:r>
           </w:p>
         </w:tc>
@@ -7767,7 +7767,7 @@
                 <w:szCs w:val="20"/>
                 <w:color w:val="000000"/>
               </w:rPr>
-              <w:t xml:space="preserve">0</w:t>
+              <w:t xml:space="preserve">1</w:t>
             </w:r>
           </w:p>
         </w:tc>
@@ -8047,7 +8047,7 @@
                 <w:szCs w:val="20"/>
                 <w:color w:val="000000"/>
               </w:rPr>
-              <w:t xml:space="preserve">0</w:t>
+              <w:t xml:space="preserve">1</w:t>
             </w:r>
           </w:p>
         </w:tc>
@@ -10007,7 +10007,7 @@
                 <w:szCs w:val="20"/>
                 <w:color w:val="000000"/>
               </w:rPr>
-              <w:t xml:space="preserve">1</w:t>
+              <w:t xml:space="preserve">0</w:t>
             </w:r>
           </w:p>
         </w:tc>
@@ -10287,7 +10287,7 @@
                 <w:szCs w:val="20"/>
                 <w:color w:val="000000"/>
               </w:rPr>
-              <w:t xml:space="preserve">1</w:t>
+              <w:t xml:space="preserve">0</w:t>
             </w:r>
           </w:p>
         </w:tc>
@@ -10567,7 +10567,7 @@
                 <w:szCs w:val="20"/>
                 <w:color w:val="000000"/>
               </w:rPr>
-              <w:t xml:space="preserve">0</w:t>
+              <w:t xml:space="preserve">1</w:t>
             </w:r>
           </w:p>
         </w:tc>
@@ -10847,7 +10847,7 @@
                 <w:szCs w:val="20"/>
                 <w:color w:val="000000"/>
               </w:rPr>
-              <w:t xml:space="preserve">1</w:t>
+              <w:t xml:space="preserve">0</w:t>
             </w:r>
           </w:p>
         </w:tc>
@@ -12527,7 +12527,7 @@
                 <w:szCs w:val="20"/>
                 <w:color w:val="000000"/>
               </w:rPr>
-              <w:t xml:space="preserve">0</w:t>
+              <w:t xml:space="preserve">1</w:t>
             </w:r>
           </w:p>
         </w:tc>
@@ -13647,7 +13647,7 @@
                 <w:szCs w:val="20"/>
                 <w:color w:val="000000"/>
               </w:rPr>
-              <w:t xml:space="preserve">1</w:t>
+              <w:t xml:space="preserve">0</w:t>
             </w:r>
           </w:p>
         </w:tc>
@@ -13927,7 +13927,7 @@
                 <w:szCs w:val="20"/>
                 <w:color w:val="000000"/>
               </w:rPr>
-              <w:t xml:space="preserve">1</w:t>
+              <w:t xml:space="preserve">0</w:t>
             </w:r>
           </w:p>
         </w:tc>
@@ -14207,7 +14207,7 @@
                 <w:szCs w:val="20"/>
                 <w:color w:val="000000"/>
               </w:rPr>
-              <w:t xml:space="preserve">1</w:t>
+              <w:t xml:space="preserve">0</w:t>
             </w:r>
           </w:p>
         </w:tc>
@@ -14767,7 +14767,7 @@
                 <w:szCs w:val="20"/>
                 <w:color w:val="000000"/>
               </w:rPr>
-              <w:t xml:space="preserve">1</w:t>
+              <w:t xml:space="preserve">0</w:t>
             </w:r>
           </w:p>
         </w:tc>
@@ -15327,7 +15327,7 @@
                 <w:szCs w:val="20"/>
                 <w:color w:val="000000"/>
               </w:rPr>
-              <w:t xml:space="preserve">1</w:t>
+              <w:t xml:space="preserve">0</w:t>
             </w:r>
           </w:p>
         </w:tc>

</xml_diff>